<commit_message>
feat: add auto-download for issued certificates and approved requests
feat(certificate-requests): add status filter and auto-download on approval
feat(documents-dashboard): auto-download issued certificates
</commit_message>
<xml_diff>
--- a/Certificate Templates/1 bgy clearance.docx
+++ b/Certificate Templates/1 bgy clearance.docx
@@ -58,8 +58,8 @@
                         <v:path o:extrusionok="f" gradientshapeok="t" o:connecttype="rect"/>
                         <o:lock v:ext="edit" aspectratio="t"/>
                       </v:shapetype>
-                      <v:shape id="_x0000_i1371" type="#_x0000_t75" style="width:159.25pt;height:57.25pt">
-                        <v:imagedata r:id="rId11" o:title="ydayle"/>
+                      <v:shape id="_x0000_i1025" type="#_x0000_t75" style="width:159pt;height:57pt">
+                        <v:imagedata r:id="rId10" o:title="ydayle"/>
                       </v:shape>
                     </w:pict>
                   </w:r>
@@ -254,8 +254,6 @@
                     <w:jc w:val="both"/>
                     <w:rPr>
                       <w:b/>
-                      <w:sz w:val="24"/>
-                      <w:szCs w:val="24"/>
                     </w:rPr>
                   </w:pPr>
                   <w:r>
@@ -276,6 +274,35 @@
                     <w:t>:</w:t>
                   </w:r>
                   <w:r>
+                    <w:t xml:space="preserve"> </w:t>
+                  </w:r>
+                  <w:r>
+                    <w:rPr>
+                      <w:b/>
+                      <w:sz w:val="24"/>
+                      <w:szCs w:val="24"/>
+                    </w:rPr>
+                    <w:t>{</w:t>
+                  </w:r>
+                  <w:proofErr w:type="spellStart"/>
+                  <w:r>
+                    <w:rPr>
+                      <w:b/>
+                      <w:sz w:val="24"/>
+                      <w:szCs w:val="24"/>
+                    </w:rPr>
+                    <w:t>resident_name</w:t>
+                  </w:r>
+                  <w:proofErr w:type="spellEnd"/>
+                  <w:r>
+                    <w:rPr>
+                      <w:b/>
+                      <w:sz w:val="24"/>
+                      <w:szCs w:val="24"/>
+                    </w:rPr>
+                    <w:t>}</w:t>
+                  </w:r>
+                  <w:r>
                     <w:rPr>
                       <w:b/>
                       <w:sz w:val="24"/>
@@ -291,14 +318,20 @@
                     </w:rPr>
                     <w:tab/>
                   </w:r>
-                </w:p>
-                <w:p>
-                  <w:pPr>
-                    <w:jc w:val="both"/>
-                    <w:rPr>
-                      <w:b/>
-                      <w:sz w:val="24"/>
-                      <w:szCs w:val="24"/>
+                  <w:r>
+                    <w:rPr>
+                      <w:b/>
+                      <w:sz w:val="24"/>
+                      <w:szCs w:val="24"/>
+                    </w:rPr>
+                    <w:tab/>
+                  </w:r>
+                </w:p>
+                <w:p>
+                  <w:pPr>
+                    <w:jc w:val="both"/>
+                    <w:rPr>
+                      <w:b/>
                     </w:rPr>
                   </w:pPr>
                   <w:r>
@@ -319,6 +352,17 @@
                     <w:t>:</w:t>
                   </w:r>
                   <w:r>
+                    <w:t xml:space="preserve"> </w:t>
+                  </w:r>
+                  <w:r>
+                    <w:rPr>
+                      <w:b/>
+                      <w:sz w:val="24"/>
+                      <w:szCs w:val="24"/>
+                    </w:rPr>
+                    <w:t>{address}</w:t>
+                  </w:r>
+                  <w:r>
                     <w:rPr>
                       <w:b/>
                       <w:sz w:val="24"/>
@@ -355,12 +399,46 @@
                   </w:r>
                   <w:r>
                     <w:rPr>
-                      <w:b/>
-                      <w:sz w:val="24"/>
-                      <w:szCs w:val="24"/>
-                    </w:rPr>
-                    <w:tab/>
-                    <w:t xml:space="preserve">   </w:t>
+                      <w:rFonts w:ascii="Calibri" w:hAnsi="Calibri"/>
+                      <w:b/>
+                      <w:sz w:val="24"/>
+                      <w:szCs w:val="24"/>
+                    </w:rPr>
+                    <w:t xml:space="preserve"> </w:t>
+                  </w:r>
+                  <w:r>
+                    <w:rPr>
+                      <w:b/>
+                      <w:sz w:val="24"/>
+                      <w:szCs w:val="24"/>
+                    </w:rPr>
+                    <w:t>{</w:t>
+                  </w:r>
+                  <w:proofErr w:type="spellStart"/>
+                  <w:r>
+                    <w:rPr>
+                      <w:b/>
+                      <w:sz w:val="24"/>
+                      <w:szCs w:val="24"/>
+                    </w:rPr>
+                    <w:t>date_of_birth</w:t>
+                  </w:r>
+                  <w:proofErr w:type="spellEnd"/>
+                  <w:r>
+                    <w:rPr>
+                      <w:b/>
+                      <w:sz w:val="24"/>
+                      <w:szCs w:val="24"/>
+                    </w:rPr>
+                    <w:t>}</w:t>
+                  </w:r>
+                  <w:r>
+                    <w:rPr>
+                      <w:b/>
+                      <w:sz w:val="24"/>
+                      <w:szCs w:val="24"/>
+                    </w:rPr>
+                    <w:t xml:space="preserve"> </w:t>
                   </w:r>
                 </w:p>
                 <w:p>
@@ -382,11 +460,38 @@
                   </w:r>
                   <w:r>
                     <w:rPr>
-                      <w:b/>
-                      <w:sz w:val="24"/>
-                      <w:szCs w:val="24"/>
-                    </w:rPr>
-                    <w:tab/>
+                      <w:rFonts w:ascii="Calibri" w:hAnsi="Calibri"/>
+                      <w:b/>
+                      <w:sz w:val="24"/>
+                      <w:szCs w:val="24"/>
+                    </w:rPr>
+                    <w:t xml:space="preserve"> </w:t>
+                  </w:r>
+                  <w:r>
+                    <w:rPr>
+                      <w:b/>
+                      <w:sz w:val="24"/>
+                      <w:szCs w:val="24"/>
+                    </w:rPr>
+                    <w:t>{</w:t>
+                  </w:r>
+                  <w:proofErr w:type="spellStart"/>
+                  <w:r>
+                    <w:rPr>
+                      <w:b/>
+                      <w:sz w:val="24"/>
+                      <w:szCs w:val="24"/>
+                    </w:rPr>
+                    <w:t>place_of_birth</w:t>
+                  </w:r>
+                  <w:proofErr w:type="spellEnd"/>
+                  <w:r>
+                    <w:rPr>
+                      <w:b/>
+                      <w:sz w:val="24"/>
+                      <w:szCs w:val="24"/>
+                    </w:rPr>
+                    <w:t>}</w:t>
                   </w:r>
                 </w:p>
                 <w:p>
@@ -416,12 +521,23 @@
                     <w:t>:</w:t>
                   </w:r>
                   <w:r>
-                    <w:rPr>
-                      <w:b/>
-                      <w:sz w:val="24"/>
-                      <w:szCs w:val="24"/>
-                    </w:rPr>
-                    <w:t xml:space="preserve">   </w:t>
+                    <w:t xml:space="preserve"> </w:t>
+                  </w:r>
+                  <w:r>
+                    <w:rPr>
+                      <w:b/>
+                      <w:sz w:val="24"/>
+                      <w:szCs w:val="24"/>
+                    </w:rPr>
+                    <w:t>{purpose}</w:t>
+                  </w:r>
+                  <w:r>
+                    <w:rPr>
+                      <w:b/>
+                      <w:sz w:val="24"/>
+                      <w:szCs w:val="24"/>
+                    </w:rPr>
+                    <w:t xml:space="preserve"> </w:t>
                   </w:r>
                 </w:p>
                 <w:p>
@@ -502,112 +618,132 @@
                       <w:sz w:val="24"/>
                       <w:szCs w:val="24"/>
                     </w:rPr>
-                    <w:t xml:space="preserve">This is to further certify that           is a </w:t>
+                    <w:t>This is to further certify that           is a bonafide resident of this Barangay.           is known to me with a good moral character, law abiding citizen in th</w:t>
+                  </w:r>
+                  <w:r>
+                    <w:rPr>
+                      <w:b/>
+                      <w:sz w:val="24"/>
+                      <w:szCs w:val="24"/>
+                    </w:rPr>
+                    <w:t xml:space="preserve">e community.          </w:t>
+                  </w:r>
+                  <w:r>
+                    <w:rPr>
+                      <w:b/>
+                      <w:sz w:val="24"/>
+                      <w:szCs w:val="24"/>
+                    </w:rPr>
+                    <w:t>has no criminal Record found in our Barangay Records.</w:t>
+                  </w:r>
+                </w:p>
+                <w:p>
+                  <w:pPr>
+                    <w:ind w:right="234"/>
+                    <w:jc w:val="both"/>
+                    <w:rPr>
+                      <w:b/>
+                      <w:sz w:val="24"/>
+                      <w:szCs w:val="24"/>
+                    </w:rPr>
+                  </w:pPr>
+                </w:p>
+                <w:p>
+                  <w:pPr>
+                    <w:ind w:right="234"/>
+                    <w:jc w:val="both"/>
+                    <w:rPr>
+                      <w:b/>
+                      <w:sz w:val="24"/>
+                      <w:szCs w:val="24"/>
+                    </w:rPr>
+                  </w:pPr>
+                </w:p>
+                <w:p>
+                  <w:pPr>
+                    <w:ind w:right="234"/>
+                    <w:jc w:val="both"/>
+                    <w:rPr>
+                      <w:b/>
+                      <w:sz w:val="24"/>
+                      <w:szCs w:val="24"/>
+                    </w:rPr>
+                  </w:pPr>
+                </w:p>
+                <w:p>
+                  <w:pPr>
+                    <w:ind w:right="234"/>
+                    <w:jc w:val="both"/>
+                    <w:rPr>
+                      <w:b/>
+                      <w:sz w:val="24"/>
+                      <w:szCs w:val="24"/>
+                    </w:rPr>
+                  </w:pPr>
+                  <w:r>
+                    <w:rPr>
+                      <w:b/>
+                      <w:sz w:val="24"/>
+                      <w:szCs w:val="24"/>
+                    </w:rPr>
+                    <w:t xml:space="preserve">Given this </w:t>
+                  </w:r>
+                </w:p>
+                <w:p>
+                  <w:pPr>
+                    <w:ind w:right="234"/>
+                    <w:jc w:val="both"/>
+                    <w:rPr>
+                      <w:rFonts w:ascii="Calibri" w:hAnsi="Calibri"/>
+                      <w:b/>
+                      <w:sz w:val="24"/>
+                      <w:szCs w:val="24"/>
+                    </w:rPr>
+                  </w:pPr>
+                  <w:r>
+                    <w:rPr>
+                      <w:b/>
+                      <w:sz w:val="24"/>
+                      <w:szCs w:val="24"/>
+                    </w:rPr>
+                    <w:t>Valid until:</w:t>
+                  </w:r>
+                  <w:r>
+                    <w:rPr>
+                      <w:rFonts w:ascii="Consolas" w:hAnsi="Consolas"/>
+                      <w:color w:val="82D99F"/>
+                      <w:kern w:val="0"/>
+                    </w:rPr>
+                    <w:t xml:space="preserve"> </w:t>
+                  </w:r>
+                  <w:r>
+                    <w:rPr>
+                      <w:rFonts w:ascii="Calibri" w:hAnsi="Calibri"/>
+                      <w:b/>
+                      <w:sz w:val="24"/>
+                      <w:szCs w:val="24"/>
+                    </w:rPr>
+                    <w:t>{</w:t>
                   </w:r>
                   <w:proofErr w:type="spellStart"/>
                   <w:r>
                     <w:rPr>
-                      <w:b/>
-                      <w:sz w:val="24"/>
-                      <w:szCs w:val="24"/>
-                    </w:rPr>
-                    <w:t>bonafide</w:t>
+                      <w:rFonts w:ascii="Calibri" w:hAnsi="Calibri"/>
+                      <w:b/>
+                      <w:sz w:val="24"/>
+                      <w:szCs w:val="24"/>
+                    </w:rPr>
+                    <w:t>valid_until</w:t>
                   </w:r>
                   <w:proofErr w:type="spellEnd"/>
                   <w:r>
                     <w:rPr>
-                      <w:b/>
-                      <w:sz w:val="24"/>
-                      <w:szCs w:val="24"/>
-                    </w:rPr>
-                    <w:t xml:space="preserve"> resident of this Barangay.           is known to me with a good moral character, law abiding citizen in th</w:t>
-                  </w:r>
-                  <w:r>
-                    <w:rPr>
-                      <w:b/>
-                      <w:sz w:val="24"/>
-                      <w:szCs w:val="24"/>
-                    </w:rPr>
-                    <w:t xml:space="preserve">e community.          </w:t>
-                  </w:r>
-                  <w:r>
-                    <w:rPr>
-                      <w:b/>
-                      <w:sz w:val="24"/>
-                      <w:szCs w:val="24"/>
-                    </w:rPr>
-                    <w:t>has no criminal Record found in our Barangay Records.</w:t>
-                  </w:r>
-                </w:p>
-                <w:p>
-                  <w:pPr>
-                    <w:ind w:right="234"/>
-                    <w:jc w:val="both"/>
-                    <w:rPr>
-                      <w:b/>
-                      <w:sz w:val="24"/>
-                      <w:szCs w:val="24"/>
-                    </w:rPr>
-                  </w:pPr>
-                </w:p>
-                <w:p>
-                  <w:pPr>
-                    <w:ind w:right="234"/>
-                    <w:jc w:val="both"/>
-                    <w:rPr>
-                      <w:b/>
-                      <w:sz w:val="24"/>
-                      <w:szCs w:val="24"/>
-                    </w:rPr>
-                  </w:pPr>
-                </w:p>
-                <w:p>
-                  <w:pPr>
-                    <w:ind w:right="234"/>
-                    <w:jc w:val="both"/>
-                    <w:rPr>
-                      <w:b/>
-                      <w:sz w:val="24"/>
-                      <w:szCs w:val="24"/>
-                    </w:rPr>
-                  </w:pPr>
-                </w:p>
-                <w:p>
-                  <w:pPr>
-                    <w:ind w:right="234"/>
-                    <w:jc w:val="both"/>
-                    <w:rPr>
-                      <w:b/>
-                      <w:sz w:val="24"/>
-                      <w:szCs w:val="24"/>
-                    </w:rPr>
-                  </w:pPr>
-                  <w:r>
-                    <w:rPr>
-                      <w:b/>
-                      <w:sz w:val="24"/>
-                      <w:szCs w:val="24"/>
-                    </w:rPr>
-                    <w:t xml:space="preserve">Given this </w:t>
-                  </w:r>
-                </w:p>
-                <w:p>
-                  <w:pPr>
-                    <w:ind w:right="234"/>
-                    <w:jc w:val="both"/>
-                    <w:rPr>
-                      <w:b/>
-                      <w:sz w:val="24"/>
-                      <w:szCs w:val="24"/>
-                    </w:rPr>
-                  </w:pPr>
-                  <w:r>
-                    <w:rPr>
-                      <w:b/>
-                      <w:sz w:val="24"/>
-                      <w:szCs w:val="24"/>
-                    </w:rPr>
-                    <w:t>Valid until:</w:t>
+                      <w:rFonts w:ascii="Calibri" w:hAnsi="Calibri"/>
+                      <w:b/>
+                      <w:sz w:val="24"/>
+                      <w:szCs w:val="24"/>
+                    </w:rPr>
+                    <w:t>}</w:t>
                   </w:r>
                 </w:p>
                 <w:p>
@@ -648,6 +784,44 @@
                     <w:tab/>
                     <w:t>:</w:t>
                   </w:r>
+                  <w:r>
+                    <w:rPr>
+                      <w:rFonts w:ascii="Calibri" w:hAnsi="Calibri"/>
+                      <w:b/>
+                      <w:sz w:val="24"/>
+                      <w:szCs w:val="24"/>
+                    </w:rPr>
+                    <w:t xml:space="preserve"> </w:t>
+                  </w:r>
+                  <w:r>
+                    <w:rPr>
+                      <w:rFonts w:ascii="Calibri" w:hAnsi="Calibri"/>
+                      <w:b/>
+                      <w:sz w:val="24"/>
+                      <w:szCs w:val="24"/>
+                    </w:rPr>
+                    <w:t>{</w:t>
+                  </w:r>
+                  <w:proofErr w:type="spellStart"/>
+                  <w:r>
+                    <w:rPr>
+                      <w:rFonts w:ascii="Calibri" w:hAnsi="Calibri"/>
+                      <w:b/>
+                      <w:sz w:val="24"/>
+                      <w:szCs w:val="24"/>
+                    </w:rPr>
+                    <w:t>ctc_no</w:t>
+                  </w:r>
+                  <w:proofErr w:type="spellEnd"/>
+                  <w:r>
+                    <w:rPr>
+                      <w:rFonts w:ascii="Calibri" w:hAnsi="Calibri"/>
+                      <w:b/>
+                      <w:sz w:val="24"/>
+                      <w:szCs w:val="24"/>
+                    </w:rPr>
+                    <w:t>}</w:t>
+                  </w:r>
                 </w:p>
                 <w:p>
                   <w:pPr>
@@ -676,6 +850,41 @@
                     <w:tab/>
                     <w:t>:</w:t>
                   </w:r>
+                  <w:r>
+                    <w:rPr>
+                      <w:rFonts w:ascii="Calibri" w:hAnsi="Calibri"/>
+                      <w:b/>
+                      <w:sz w:val="24"/>
+                      <w:szCs w:val="24"/>
+                    </w:rPr>
+                    <w:t xml:space="preserve"> </w:t>
+                  </w:r>
+                  <w:r>
+                    <w:rPr>
+                      <w:b/>
+                      <w:sz w:val="24"/>
+                      <w:szCs w:val="24"/>
+                    </w:rPr>
+                    <w:t>{</w:t>
+                  </w:r>
+                  <w:proofErr w:type="spellStart"/>
+                  <w:r>
+                    <w:rPr>
+                      <w:b/>
+                      <w:sz w:val="24"/>
+                      <w:szCs w:val="24"/>
+                    </w:rPr>
+                    <w:t>issued_at</w:t>
+                  </w:r>
+                  <w:proofErr w:type="spellEnd"/>
+                  <w:r>
+                    <w:rPr>
+                      <w:b/>
+                      <w:sz w:val="24"/>
+                      <w:szCs w:val="24"/>
+                    </w:rPr>
+                    <w:t>}</w:t>
+                  </w:r>
                 </w:p>
                 <w:p>
                   <w:pPr>
@@ -704,6 +913,41 @@
                     <w:tab/>
                     <w:t>:</w:t>
                   </w:r>
+                  <w:r>
+                    <w:rPr>
+                      <w:rFonts w:ascii="Calibri" w:hAnsi="Calibri"/>
+                      <w:b/>
+                      <w:sz w:val="24"/>
+                      <w:szCs w:val="24"/>
+                    </w:rPr>
+                    <w:t xml:space="preserve"> </w:t>
+                  </w:r>
+                  <w:r>
+                    <w:rPr>
+                      <w:b/>
+                      <w:sz w:val="24"/>
+                      <w:szCs w:val="24"/>
+                    </w:rPr>
+                    <w:t>{</w:t>
+                  </w:r>
+                  <w:proofErr w:type="spellStart"/>
+                  <w:r>
+                    <w:rPr>
+                      <w:b/>
+                      <w:sz w:val="24"/>
+                      <w:szCs w:val="24"/>
+                    </w:rPr>
+                    <w:t>issued_on</w:t>
+                  </w:r>
+                  <w:proofErr w:type="spellEnd"/>
+                  <w:r>
+                    <w:rPr>
+                      <w:b/>
+                      <w:sz w:val="24"/>
+                      <w:szCs w:val="24"/>
+                    </w:rPr>
+                    <w:t>}</w:t>
+                  </w:r>
                 </w:p>
                 <w:p>
                   <w:pPr>
@@ -732,6 +976,41 @@
                     <w:tab/>
                     <w:t>:</w:t>
                   </w:r>
+                  <w:r>
+                    <w:rPr>
+                      <w:rFonts w:ascii="Calibri" w:hAnsi="Calibri"/>
+                      <w:b/>
+                      <w:sz w:val="24"/>
+                      <w:szCs w:val="24"/>
+                    </w:rPr>
+                    <w:t xml:space="preserve"> </w:t>
+                  </w:r>
+                  <w:r>
+                    <w:rPr>
+                      <w:b/>
+                      <w:sz w:val="24"/>
+                      <w:szCs w:val="24"/>
+                    </w:rPr>
+                    <w:t>{</w:t>
+                  </w:r>
+                  <w:proofErr w:type="spellStart"/>
+                  <w:r>
+                    <w:rPr>
+                      <w:b/>
+                      <w:sz w:val="24"/>
+                      <w:szCs w:val="24"/>
+                    </w:rPr>
+                    <w:t>or_no</w:t>
+                  </w:r>
+                  <w:proofErr w:type="spellEnd"/>
+                  <w:r>
+                    <w:rPr>
+                      <w:b/>
+                      <w:sz w:val="24"/>
+                      <w:szCs w:val="24"/>
+                    </w:rPr>
+                    <w:t>}</w:t>
+                  </w:r>
                 </w:p>
                 <w:p>
                   <w:pPr>
@@ -757,9 +1036,72 @@
                       <w:sz w:val="24"/>
                       <w:szCs w:val="24"/>
                     </w:rPr>
-                    <w:tab/>
+                    <w:t xml:space="preserve"> </w:t>
+                  </w:r>
+                  <w:proofErr w:type="gramStart"/>
+                  <w:r>
+                    <w:rPr>
+                      <w:b/>
+                      <w:sz w:val="24"/>
+                      <w:szCs w:val="24"/>
+                    </w:rPr>
+                    <w:t xml:space="preserve">  </w:t>
+                  </w:r>
+                  <w:r>
+                    <w:rPr>
+                      <w:b/>
+                      <w:sz w:val="24"/>
+                      <w:szCs w:val="24"/>
+                    </w:rPr>
                     <w:t>:</w:t>
                   </w:r>
+                  <w:proofErr w:type="gramEnd"/>
+                  <w:r>
+                    <w:rPr>
+                      <w:rFonts w:ascii="Calibri" w:hAnsi="Calibri"/>
+                      <w:b/>
+                      <w:sz w:val="24"/>
+                      <w:szCs w:val="24"/>
+                    </w:rPr>
+                    <w:t xml:space="preserve"> </w:t>
+                  </w:r>
+                  <w:r>
+                    <w:rPr>
+                      <w:b/>
+                      <w:sz w:val="24"/>
+                      <w:szCs w:val="24"/>
+                    </w:rPr>
+                    <w:t>{</w:t>
+                  </w:r>
+                  <w:proofErr w:type="spellStart"/>
+                  <w:r>
+                    <w:rPr>
+                      <w:b/>
+                      <w:sz w:val="24"/>
+                      <w:szCs w:val="24"/>
+                    </w:rPr>
+                    <w:t>prepared_by</w:t>
+                  </w:r>
+                  <w:proofErr w:type="spellEnd"/>
+                  <w:r>
+                    <w:rPr>
+                      <w:b/>
+                      <w:sz w:val="24"/>
+                      <w:szCs w:val="24"/>
+                    </w:rPr>
+                    <w:t>}</w:t>
+                  </w:r>
+                </w:p>
+                <w:p>
+                  <w:pPr>
+                    <w:ind w:right="234"/>
+                    <w:jc w:val="both"/>
+                    <w:rPr>
+                      <w:b/>
+                      <w:sz w:val="24"/>
+                      <w:szCs w:val="24"/>
+                    </w:rPr>
+                  </w:pPr>
                 </w:p>
                 <w:p/>
                 <w:p/>
@@ -782,8 +1124,8 @@
                 <w:p>
                   <w:r>
                     <w:pict w14:anchorId="00D88701">
-                      <v:shape id="_x0000_i1325" type="#_x0000_t75" style="width:614.2pt;height:8in">
-                        <v:imagedata r:id="rId12" o:title="seal"/>
+                      <v:shape id="_x0000_i1026" type="#_x0000_t75" style="width:614.25pt;height:8in">
+                        <v:imagedata r:id="rId11" o:title="seal"/>
                       </v:shape>
                     </w:pict>
                   </w:r>
@@ -800,14 +1142,14 @@
           <w:szCs w:val="16"/>
         </w:rPr>
         <w:pict w14:anchorId="325DBA21">
-          <v:shape id="_x0000_s2079" type="#_x0000_t202" style="position:absolute;margin-left:184.7pt;margin-top:560pt;width:152.95pt;height:65.35pt;z-index:7;visibility:visible;mso-wrap-style:none" filled="f" stroked="f">
+          <v:shape id="_x0000_s2079" type="#_x0000_t202" style="position:absolute;margin-left:184.7pt;margin-top:560pt;width:238.7pt;height:85.95pt;z-index:7;visibility:visible;mso-wrap-style:none" filled="f" stroked="f">
             <v:textbox style="mso-next-textbox:#_x0000_s2079;mso-fit-shape-to-text:t">
               <w:txbxContent>
                 <w:p>
                   <w:r>
                     <w:pict w14:anchorId="5FEA726E">
-                      <v:shape id="_x0000_i1403" type="#_x0000_t75" style="width:224.75pt;height:79.1pt">
-                        <v:imagedata r:id="rId13" o:title="bocaue river"/>
+                      <v:shape id="_x0000_i1027" type="#_x0000_t75" style="width:224.25pt;height:78.75pt">
+                        <v:imagedata r:id="rId12" o:title="bocaue river"/>
                       </v:shape>
                     </w:pict>
                   </w:r>
@@ -917,8 +1259,8 @@
       </w:r>
     </w:p>
     <w:sectPr>
-      <w:headerReference w:type="default" r:id="rId14"/>
-      <w:footerReference w:type="default" r:id="rId15"/>
+      <w:headerReference w:type="default" r:id="rId13"/>
+      <w:footerReference w:type="default" r:id="rId14"/>
       <w:pgSz w:w="12240" w:h="15840"/>
       <w:pgMar w:top="1440" w:right="180" w:bottom="1440" w:left="180" w:header="180" w:footer="150" w:gutter="0"/>
       <w:cols w:space="720"/>
@@ -977,7 +1319,7 @@
           <v:path o:extrusionok="f" gradientshapeok="t" o:connecttype="rect"/>
           <o:lock v:ext="edit" aspectratio="t"/>
         </v:shapetype>
-        <v:shape id="_x0000_s1029" type="#_x0000_t75" style="position:absolute;margin-left:-10.9pt;margin-top:-106.75pt;width:616.2pt;height:127.4pt;z-index:2;mso-position-horizontal:absolute;mso-position-horizontal-relative:text;mso-position-vertical:absolute;mso-position-vertical-relative:text;mso-width-relative:page;mso-height-relative:page">
+        <v:shape id="_x0000_s1029" type="#_x0000_t75" style="position:absolute;margin-left:-10.9pt;margin-top:-106.75pt;width:616.2pt;height:127.4pt;z-index:2">
           <v:imagedata r:id="rId1" o:title="footer1"/>
         </v:shape>
       </w:pict>
@@ -1035,7 +1377,7 @@
           <v:path o:extrusionok="f" gradientshapeok="t" o:connecttype="rect"/>
           <o:lock v:ext="edit" aspectratio="t"/>
         </v:shapetype>
-        <v:shape id="_x0000_s1031" type="#_x0000_t75" style="position:absolute;margin-left:441pt;margin-top:-22.1pt;width:171.8pt;height:114.05pt;z-index:4;mso-position-horizontal-relative:text;mso-position-vertical-relative:text;mso-width-relative:page;mso-height-relative:page">
+        <v:shape id="_x0000_s1031" type="#_x0000_t75" style="position:absolute;margin-left:441pt;margin-top:-22.1pt;width:171.8pt;height:114.05pt;z-index:4">
           <v:imagedata r:id="rId1" o:title="bocaue"/>
         </v:shape>
       </w:pict>
@@ -1045,7 +1387,7 @@
         <w:noProof/>
       </w:rPr>
       <w:pict w14:anchorId="5AA8AA5F">
-        <v:shape id="_x0000_s1030" type="#_x0000_t75" style="position:absolute;margin-left:3.6pt;margin-top:-16.7pt;width:130.9pt;height:97.5pt;z-index:3;mso-position-horizontal-relative:text;mso-position-vertical-relative:text;mso-width-relative:page;mso-height-relative:page">
+        <v:shape id="_x0000_s1030" type="#_x0000_t75" style="position:absolute;margin-left:3.6pt;margin-top:-16.7pt;width:130.9pt;height:97.5pt;z-index:3">
           <v:imagedata r:id="rId2" o:title="logo"/>
         </v:shape>
       </w:pict>
@@ -1055,7 +1397,7 @@
         <w:noProof/>
       </w:rPr>
       <w:pict w14:anchorId="179CA34A">
-        <v:shape id="_x0000_s1027" type="#_x0000_t75" style="position:absolute;margin-left:-10.9pt;margin-top:-10.1pt;width:616.2pt;height:88.8pt;z-index:1;mso-position-horizontal-relative:text;mso-position-vertical-relative:text;mso-width-relative:page;mso-height-relative:page">
+        <v:shape id="_x0000_s1027" type="#_x0000_t75" style="position:absolute;margin-left:-10.9pt;margin-top:-10.1pt;width:616.2pt;height:88.8pt;z-index:1">
           <v:imagedata r:id="rId3" o:title="head"/>
         </v:shape>
       </w:pict>
@@ -1064,17 +1406,13 @@
 </w:hdr>
 </file>
 
-<file path=word/numbering.xml><?xml version="1.0" encoding="utf-8"?>
-<w:numbering xmlns:wpc="http://schemas.microsoft.com/office/word/2010/wordprocessingCanvas" xmlns:cx="http://schemas.microsoft.com/office/drawing/2014/chartex" xmlns:cx1="http://schemas.microsoft.com/office/drawing/2015/9/8/chartex" xmlns:cx2="http://schemas.microsoft.com/office/drawing/2015/10/21/chartex" xmlns:cx3="http://schemas.microsoft.com/office/drawing/2016/5/9/chartex" xmlns:cx4="http://schemas.microsoft.com/office/drawing/2016/5/10/chartex" xmlns:cx5="http://schemas.microsoft.com/office/drawing/2016/5/11/chartex" xmlns:cx6="http://schemas.microsoft.com/office/drawing/2016/5/12/chartex" xmlns:cx7="http://schemas.microsoft.com/office/drawing/2016/5/13/chartex" xmlns:cx8="http://schemas.microsoft.com/office/drawing/2016/5/14/chartex" xmlns:mc="http://schemas.openxmlformats.org/markup-compatibility/2006" xmlns:aink="http://schemas.microsoft.com/office/drawing/2016/ink" xmlns:am3d="http://schemas.microsoft.com/office/drawing/2017/model3d" xmlns:o="urn:schemas-microsoft-com:office:office" xmlns:oel="http://schemas.microsoft.com/office/2019/extlst" xmlns:r="http://schemas.openxmlformats.org/officeDocument/2006/relationships" xmlns:m="http://schemas.openxmlformats.org/officeDocument/2006/math" xmlns:v="urn:schemas-microsoft-com:vml" xmlns:wp14="http://schemas.microsoft.com/office/word/2010/wordprocessingDrawing" xmlns:wp="http://schemas.openxmlformats.org/drawingml/2006/wordprocessingDrawing" xmlns:w10="urn:schemas-microsoft-com:office:word" xmlns:w="http://schemas.openxmlformats.org/wordprocessingml/2006/main" xmlns:w14="http://schemas.microsoft.com/office/word/2010/wordml" xmlns:w15="http://schemas.microsoft.com/office/word/2012/wordml" xmlns:w16cex="http://schemas.microsoft.com/office/word/2018/wordml/cex" xmlns:w16cid="http://schemas.microsoft.com/office/word/2016/wordml/cid" xmlns:w16="http://schemas.microsoft.com/office/word/2018/wordml" xmlns:w16du="http://schemas.microsoft.com/office/word/2023/wordml/word16du" xmlns:w16sdtdh="http://schemas.microsoft.com/office/word/2020/wordml/sdtdatahash" xmlns:w16sdtfl="http://schemas.microsoft.com/office/word/2024/wordml/sdtformatlock" xmlns:w16se="http://schemas.microsoft.com/office/word/2015/wordml/symex" xmlns:wpg="http://schemas.microsoft.com/office/word/2010/wordprocessingGroup" xmlns:wpi="http://schemas.microsoft.com/office/word/2010/wordprocessingInk" xmlns:wne="http://schemas.microsoft.com/office/word/2006/wordml" xmlns:wps="http://schemas.microsoft.com/office/word/2010/wordprocessingShape" mc:Ignorable="w14 w15 w16se w16cid w16 w16cex w16sdtdh w16sdtfl w16du wp14"/>
-</file>
-
 <file path=word/styles.xml><?xml version="1.0" encoding="utf-8"?>
 <w:styles xmlns:mc="http://schemas.openxmlformats.org/markup-compatibility/2006" xmlns:r="http://schemas.openxmlformats.org/officeDocument/2006/relationships" xmlns:w="http://schemas.openxmlformats.org/wordprocessingml/2006/main" xmlns:w14="http://schemas.microsoft.com/office/word/2010/wordml" xmlns:w15="http://schemas.microsoft.com/office/word/2012/wordml" xmlns:w16cex="http://schemas.microsoft.com/office/word/2018/wordml/cex" xmlns:w16cid="http://schemas.microsoft.com/office/word/2016/wordml/cid" xmlns:w16="http://schemas.microsoft.com/office/word/2018/wordml" xmlns:w16du="http://schemas.microsoft.com/office/word/2023/wordml/word16du" xmlns:w16sdtdh="http://schemas.microsoft.com/office/word/2020/wordml/sdtdatahash" xmlns:w16sdtfl="http://schemas.microsoft.com/office/word/2024/wordml/sdtformatlock" xmlns:w16se="http://schemas.microsoft.com/office/word/2015/wordml/symex" mc:Ignorable="w14 w15 w16se w16cid w16 w16cex w16sdtdh w16sdtfl w16du">
   <w:docDefaults>
     <w:rPrDefault>
       <w:rPr>
         <w:rFonts w:ascii="Calibri" w:eastAsia="Calibri" w:hAnsi="Calibri" w:cs="Times New Roman"/>
-        <w:lang w:val="en-US" w:eastAsia="en-US" w:bidi="ar-SA"/>
+        <w:lang w:val="en-PH" w:eastAsia="en-PH" w:bidi="ar-SA"/>
       </w:rPr>
     </w:rPrDefault>
     <w:pPrDefault/>
@@ -1465,13 +1803,11 @@
       <w:rFonts w:ascii="Times New Roman" w:eastAsia="Times New Roman" w:hAnsi="Times New Roman"/>
       <w:color w:val="000000"/>
       <w:kern w:val="28"/>
-      <w:lang w:val="en-PH" w:eastAsia="en-PH"/>
     </w:rPr>
   </w:style>
   <w:style w:type="character" w:default="1" w:styleId="DefaultParagraphFont">
     <w:name w:val="Default Paragraph Font"/>
     <w:uiPriority w:val="1"/>
-    <w:semiHidden/>
     <w:unhideWhenUsed/>
   </w:style>
   <w:style w:type="table" w:default="1" w:styleId="TableNormal">
@@ -1479,7 +1815,6 @@
     <w:uiPriority w:val="99"/>
     <w:semiHidden/>
     <w:unhideWhenUsed/>
-    <w:qFormat/>
     <w:tblPr>
       <w:tblInd w:w="0" w:type="dxa"/>
       <w:tblCellMar>
@@ -1573,7 +1908,18 @@
       <w:rFonts w:ascii="Times New Roman" w:eastAsia="Times New Roman" w:hAnsi="Times New Roman"/>
       <w:color w:val="000000"/>
       <w:kern w:val="28"/>
-      <w:lang w:val="en-PH" w:eastAsia="en-PH"/>
+    </w:rPr>
+  </w:style>
+  <w:style w:type="paragraph" w:styleId="NormalWeb">
+    <w:name w:val="Normal (Web)"/>
+    <w:basedOn w:val="Normal"/>
+    <w:uiPriority w:val="99"/>
+    <w:semiHidden/>
+    <w:unhideWhenUsed/>
+    <w:rsid w:val="00A87E4B"/>
+    <w:rPr>
+      <w:sz w:val="24"/>
+      <w:szCs w:val="24"/>
     </w:rPr>
   </w:style>
 </w:styles>
@@ -1899,6 +2245,15 @@
 </file>
 
 <file path=customXml/item2.xml><?xml version="1.0" encoding="utf-8"?>
+<?mso-contentType ?>
+<FormTemplates xmlns="http://schemas.microsoft.com/sharepoint/v3/contenttype/forms">
+  <Display>DocumentLibraryForm</Display>
+  <Edit>DocumentLibraryForm</Edit>
+  <New>DocumentLibraryForm</New>
+</FormTemplates>
+</file>
+
+<file path=customXml/item3.xml><?xml version="1.0" encoding="utf-8"?>
 <ct:contentTypeSchema xmlns:ct="http://schemas.microsoft.com/office/2006/metadata/contentType" xmlns:ma="http://schemas.microsoft.com/office/2006/metadata/properties/metaAttributes" ct:_="" ma:_="" ma:contentTypeName="Document" ma:contentTypeID="0x0101007D120E869F788B468EF0F2E8C2D859E9" ma:contentTypeVersion="9" ma:contentTypeDescription="Create a new document." ma:contentTypeScope="" ma:versionID="9097591ac1faff6b314fd596f725bb18">
   <xsd:schema xmlns:xsd="http://www.w3.org/2001/XMLSchema" xmlns:xs="http://www.w3.org/2001/XMLSchema" xmlns:p="http://schemas.microsoft.com/office/2006/metadata/properties" xmlns:ns3="2ef9d09a-be38-4663-9965-b08fa9d018de" targetNamespace="http://schemas.microsoft.com/office/2006/metadata/properties" ma:root="true" ma:fieldsID="96d5977281e4467ccffcbf85f84e2519" ns3:_="">
     <xsd:import namespace="2ef9d09a-be38-4663-9965-b08fa9d018de"/>
@@ -2074,15 +2429,6 @@
 </ct:contentTypeSchema>
 </file>
 
-<file path=customXml/item3.xml><?xml version="1.0" encoding="utf-8"?>
-<?mso-contentType ?>
-<FormTemplates xmlns="http://schemas.microsoft.com/sharepoint/v3/contenttype/forms">
-  <Display>DocumentLibraryForm</Display>
-  <Edit>DocumentLibraryForm</Edit>
-  <New>DocumentLibraryForm</New>
-</FormTemplates>
-</file>
-
 <file path=customXml/item4.xml><?xml version="1.0" encoding="utf-8"?>
 <p:properties xmlns:p="http://schemas.microsoft.com/office/2006/metadata/properties" xmlns:xsi="http://www.w3.org/2001/XMLSchema-instance" xmlns:pc="http://schemas.microsoft.com/office/infopath/2007/PartnerControls">
   <documentManagement>
@@ -2100,6 +2446,14 @@
 </file>
 
 <file path=customXml/itemProps2.xml><?xml version="1.0" encoding="utf-8"?>
+<ds:datastoreItem xmlns:ds="http://schemas.openxmlformats.org/officeDocument/2006/customXml" ds:itemID="{2FD20508-790D-493D-AD48-37FD0D704762}">
+  <ds:schemaRefs>
+    <ds:schemaRef ds:uri="http://schemas.microsoft.com/sharepoint/v3/contenttype/forms"/>
+  </ds:schemaRefs>
+</ds:datastoreItem>
+</file>
+
+<file path=customXml/itemProps3.xml><?xml version="1.0" encoding="utf-8"?>
 <ds:datastoreItem xmlns:ds="http://schemas.openxmlformats.org/officeDocument/2006/customXml" ds:itemID="{3FECC726-D3EF-4F84-B987-3CC1FA916005}">
   <ds:schemaRefs>
     <ds:schemaRef ds:uri="http://schemas.microsoft.com/office/2006/metadata/contentType"/>
@@ -2117,14 +2471,6 @@
 </ds:datastoreItem>
 </file>
 
-<file path=customXml/itemProps3.xml><?xml version="1.0" encoding="utf-8"?>
-<ds:datastoreItem xmlns:ds="http://schemas.openxmlformats.org/officeDocument/2006/customXml" ds:itemID="{2FD20508-790D-493D-AD48-37FD0D704762}">
-  <ds:schemaRefs>
-    <ds:schemaRef ds:uri="http://schemas.microsoft.com/sharepoint/v3/contenttype/forms"/>
-  </ds:schemaRefs>
-</ds:datastoreItem>
-</file>
-
 <file path=customXml/itemProps4.xml><?xml version="1.0" encoding="utf-8"?>
 <ds:datastoreItem xmlns:ds="http://schemas.openxmlformats.org/officeDocument/2006/customXml" ds:itemID="{63237037-D3DB-4CA1-BF94-F33BBDA483A0}">
   <ds:schemaRefs>

</xml_diff>